<commit_message>
knowleddge 7/3/2026 part 15
</commit_message>
<xml_diff>
--- a/Knowledge/3-Work knowledge/1-Software Engineering/2-General Technologies/9-Databases/5-My Source/2-SQL/7-SQL Commands - Administrative Commands/2-SQL Storage Engines.docx
+++ b/Knowledge/3-Work knowledge/1-Software Engineering/2-General Technologies/9-Databases/5-My Source/2-SQL/7-SQL Commands - Administrative Commands/2-SQL Storage Engines.docx
@@ -58,7 +58,27 @@
           <w:sz w:val="18"/>
           <w:highlight w:val="lightGray"/>
         </w:rPr>
-        <w:t xml:space="preserve">: Persons Table -&gt; ID Column: 1, Name_En Column: Motasem Essam] -&gt; </w:t>
+        <w:t xml:space="preserve">: Persons Table -&gt; ID Column: 1, </w:t>
+      </w:r>
+      <w:proofErr w:type="spellStart"/>
+      <w:r>
+        <w:rPr>
+          <w:rFonts w:ascii="Arial" w:eastAsia="Arial" w:hAnsi="Arial" w:cs="Arial"/>
+          <w:color w:val="000000"/>
+          <w:sz w:val="18"/>
+          <w:highlight w:val="lightGray"/>
+        </w:rPr>
+        <w:t>Name_En</w:t>
+      </w:r>
+      <w:proofErr w:type="spellEnd"/>
+      <w:r>
+        <w:rPr>
+          <w:rFonts w:ascii="Arial" w:eastAsia="Arial" w:hAnsi="Arial" w:cs="Arial"/>
+          <w:color w:val="000000"/>
+          <w:sz w:val="18"/>
+          <w:highlight w:val="lightGray"/>
+        </w:rPr>
+        <w:t xml:space="preserve"> Column: Motasem Essam] -&gt; </w:t>
       </w:r>
       <w:r>
         <w:rPr>
@@ -218,7 +238,27 @@
           <w:sz w:val="18"/>
           <w:highlight w:val="lightGray"/>
         </w:rPr>
-        <w:t xml:space="preserve">: Persons Table -&gt; ID Column: 1, Name_En Column: Motasem Essam] -&gt; </w:t>
+        <w:t xml:space="preserve">: Persons Table -&gt; ID Column: 1, </w:t>
+      </w:r>
+      <w:proofErr w:type="spellStart"/>
+      <w:r>
+        <w:rPr>
+          <w:rFonts w:ascii="Arial" w:eastAsia="Arial" w:hAnsi="Arial" w:cs="Arial"/>
+          <w:color w:val="000000"/>
+          <w:sz w:val="18"/>
+          <w:highlight w:val="lightGray"/>
+        </w:rPr>
+        <w:t>Name_En</w:t>
+      </w:r>
+      <w:proofErr w:type="spellEnd"/>
+      <w:r>
+        <w:rPr>
+          <w:rFonts w:ascii="Arial" w:eastAsia="Arial" w:hAnsi="Arial" w:cs="Arial"/>
+          <w:color w:val="000000"/>
+          <w:sz w:val="18"/>
+          <w:highlight w:val="lightGray"/>
+        </w:rPr>
+        <w:t xml:space="preserve"> Column: Motasem Essam] -&gt; </w:t>
       </w:r>
       <w:r>
         <w:rPr>
@@ -363,6 +403,7 @@
             </w:tcMar>
           </w:tcPr>
           <w:p>
+            <w:proofErr w:type="spellStart"/>
             <w:r>
               <w:rPr>
                 <w:rFonts w:ascii="Roboto Mono" w:eastAsia="Roboto Mono" w:hAnsi="Roboto Mono"/>
@@ -371,6 +412,7 @@
               </w:rPr>
               <w:t>InnoDB</w:t>
             </w:r>
+            <w:proofErr w:type="spellEnd"/>
           </w:p>
         </w:tc>
         <w:tc>
@@ -462,6 +504,7 @@
             </w:tcMar>
           </w:tcPr>
           <w:p>
+            <w:proofErr w:type="spellStart"/>
             <w:r>
               <w:rPr>
                 <w:rFonts w:ascii="Roboto Mono" w:eastAsia="Roboto Mono" w:hAnsi="Roboto Mono"/>
@@ -470,6 +513,7 @@
               </w:rPr>
               <w:t>MyISAM</w:t>
             </w:r>
+            <w:proofErr w:type="spellEnd"/>
           </w:p>
         </w:tc>
         <w:tc>
@@ -695,6 +739,7 @@
                 <w:b/>
                 <w:bCs/>
               </w:rPr>
+              <w:lastRenderedPageBreak/>
               <w:t>ARCHIVE</w:t>
             </w:r>
           </w:p>
@@ -812,17 +857,6 @@
       </w:tr>
     </w:tbl>
     <w:p>
-      <w:pPr>
-        <w:pStyle w:val="Heading2"/>
-        <w:keepNext w:val="0"/>
-        <w:keepLines w:val="0"/>
-        <w:rPr>
-          <w:b/>
-          <w:bCs/>
-          <w:sz w:val="34"/>
-          <w:szCs w:val="34"/>
-        </w:rPr>
-      </w:pPr>
       <w:bookmarkStart w:id="3" w:name="_qvpe7w979i9t" w:colFirst="0" w:colLast="0"/>
       <w:bookmarkEnd w:id="3"/>
     </w:p>
@@ -835,7 +869,15 @@
       <w:bookmarkStart w:id="4" w:name="_1getj9oj2vwr" w:colFirst="0" w:colLast="0"/>
       <w:bookmarkEnd w:id="4"/>
       <w:r>
-        <w:t>🔧 1. InnoDB (✅ Default in modern MySQL)</w:t>
+        <w:t xml:space="preserve">🔧 1. </w:t>
+      </w:r>
+      <w:proofErr w:type="spellStart"/>
+      <w:r>
+        <w:t>InnoDB</w:t>
+      </w:r>
+      <w:proofErr w:type="spellEnd"/>
+      <w:r>
+        <w:t xml:space="preserve"> (✅ Default in modern MySQL)</w:t>
       </w:r>
     </w:p>
     <w:p>
@@ -859,7 +901,27 @@
           <w:sz w:val="18"/>
           <w:highlight w:val="lightGray"/>
         </w:rPr>
-        <w:t xml:space="preserve">: Persons Table -&gt; ID Column: 1, Name_En Column: Motasem Essam] -&gt; </w:t>
+        <w:t xml:space="preserve">: Persons Table -&gt; ID Column: 1, </w:t>
+      </w:r>
+      <w:proofErr w:type="spellStart"/>
+      <w:r>
+        <w:rPr>
+          <w:rFonts w:ascii="Arial" w:eastAsia="Arial" w:hAnsi="Arial" w:cs="Arial"/>
+          <w:color w:val="000000"/>
+          <w:sz w:val="18"/>
+          <w:highlight w:val="lightGray"/>
+        </w:rPr>
+        <w:t>Name_En</w:t>
+      </w:r>
+      <w:proofErr w:type="spellEnd"/>
+      <w:r>
+        <w:rPr>
+          <w:rFonts w:ascii="Arial" w:eastAsia="Arial" w:hAnsi="Arial" w:cs="Arial"/>
+          <w:color w:val="000000"/>
+          <w:sz w:val="18"/>
+          <w:highlight w:val="lightGray"/>
+        </w:rPr>
+        <w:t xml:space="preserve"> Column: Motasem Essam] -&gt; </w:t>
       </w:r>
       <w:r>
         <w:rPr>
@@ -1208,8 +1270,19 @@
           <w:b/>
           <w:bCs/>
         </w:rPr>
-        <w:t>Slightly slower on simple read-only queries than MyISAM</w:t>
-      </w:r>
+        <w:lastRenderedPageBreak/>
+        <w:t xml:space="preserve">Slightly slower on simple read-only queries than </w:t>
+      </w:r>
+      <w:proofErr w:type="spellStart"/>
+      <w:r>
+        <w:rPr>
+          <w:rFonts w:ascii="Roboto Mono" w:eastAsia="Roboto Mono" w:hAnsi="Roboto Mono"/>
+          <w:b/>
+          <w:bCs/>
+        </w:rPr>
+        <w:t>MyISAM</w:t>
+      </w:r>
+      <w:proofErr w:type="spellEnd"/>
       <w:r>
         <w:rPr>
           <w:rFonts w:ascii="Roboto Mono" w:eastAsia="Roboto Mono" w:hAnsi="Roboto Mono"/>
@@ -1274,7 +1347,15 @@
       <w:bookmarkStart w:id="5" w:name="_uoexbdxw2ej6" w:colFirst="0" w:colLast="0"/>
       <w:bookmarkEnd w:id="5"/>
       <w:r>
-        <w:t>📚 2. MyISAM (Legacy engine)</w:t>
+        <w:t xml:space="preserve">📚 2. </w:t>
+      </w:r>
+      <w:proofErr w:type="spellStart"/>
+      <w:r>
+        <w:t>MyISAM</w:t>
+      </w:r>
+      <w:proofErr w:type="spellEnd"/>
+      <w:r>
+        <w:t xml:space="preserve"> (Legacy engine)</w:t>
       </w:r>
     </w:p>
     <w:p>
@@ -1298,7 +1379,27 @@
           <w:sz w:val="18"/>
           <w:highlight w:val="lightGray"/>
         </w:rPr>
-        <w:t xml:space="preserve">: Persons Table -&gt; ID Column: 1, Name_En Column: Motasem Essam] -&gt; </w:t>
+        <w:t xml:space="preserve">: Persons Table -&gt; ID Column: 1, </w:t>
+      </w:r>
+      <w:proofErr w:type="spellStart"/>
+      <w:r>
+        <w:rPr>
+          <w:rFonts w:ascii="Arial" w:eastAsia="Arial" w:hAnsi="Arial" w:cs="Arial"/>
+          <w:color w:val="000000"/>
+          <w:sz w:val="18"/>
+          <w:highlight w:val="lightGray"/>
+        </w:rPr>
+        <w:t>Name_En</w:t>
+      </w:r>
+      <w:proofErr w:type="spellEnd"/>
+      <w:r>
+        <w:rPr>
+          <w:rFonts w:ascii="Arial" w:eastAsia="Arial" w:hAnsi="Arial" w:cs="Arial"/>
+          <w:color w:val="000000"/>
+          <w:sz w:val="18"/>
+          <w:highlight w:val="lightGray"/>
+        </w:rPr>
+        <w:t xml:space="preserve"> Column: Motasem Essam] -&gt; </w:t>
       </w:r>
       <w:r>
         <w:rPr>
@@ -1464,7 +1565,25 @@
           <w:b/>
           <w:bCs/>
         </w:rPr>
-        <w:t>Supports FULLTEXT indexing before InnoDB did</w:t>
+        <w:t xml:space="preserve">Supports FULLTEXT indexing before </w:t>
+      </w:r>
+      <w:proofErr w:type="spellStart"/>
+      <w:r>
+        <w:rPr>
+          <w:rFonts w:ascii="Roboto Mono" w:eastAsia="Roboto Mono" w:hAnsi="Roboto Mono"/>
+          <w:b/>
+          <w:bCs/>
+        </w:rPr>
+        <w:t>InnoDB</w:t>
+      </w:r>
+      <w:proofErr w:type="spellEnd"/>
+      <w:r>
+        <w:rPr>
+          <w:rFonts w:ascii="Roboto Mono" w:eastAsia="Roboto Mono" w:hAnsi="Roboto Mono"/>
+          <w:b/>
+          <w:bCs/>
+        </w:rPr>
+        <w:t xml:space="preserve"> did</w:t>
       </w:r>
       <w:r>
         <w:rPr>
@@ -1676,6 +1795,7 @@
           <w:b/>
           <w:bCs/>
         </w:rPr>
+        <w:lastRenderedPageBreak/>
         <w:t>❌ Poor crash recovery (requires REPAIR TABLE)</w:t>
       </w:r>
       <w:r>
@@ -1737,7 +1857,27 @@
           <w:sz w:val="18"/>
           <w:highlight w:val="lightGray"/>
         </w:rPr>
-        <w:t xml:space="preserve">: Persons Table -&gt; ID Column: 1, Name_En Column: Motasem Essam] -&gt; </w:t>
+        <w:t xml:space="preserve">: Persons Table -&gt; ID Column: 1, </w:t>
+      </w:r>
+      <w:proofErr w:type="spellStart"/>
+      <w:r>
+        <w:rPr>
+          <w:rFonts w:ascii="Arial" w:eastAsia="Arial" w:hAnsi="Arial" w:cs="Arial"/>
+          <w:color w:val="000000"/>
+          <w:sz w:val="18"/>
+          <w:highlight w:val="lightGray"/>
+        </w:rPr>
+        <w:t>Name_En</w:t>
+      </w:r>
+      <w:proofErr w:type="spellEnd"/>
+      <w:r>
+        <w:rPr>
+          <w:rFonts w:ascii="Arial" w:eastAsia="Arial" w:hAnsi="Arial" w:cs="Arial"/>
+          <w:color w:val="000000"/>
+          <w:sz w:val="18"/>
+          <w:highlight w:val="lightGray"/>
+        </w:rPr>
+        <w:t xml:space="preserve"> Column: Motasem Essam] -&gt; </w:t>
       </w:r>
       <w:r>
         <w:rPr>
@@ -2117,7 +2257,27 @@
           <w:sz w:val="18"/>
           <w:highlight w:val="lightGray"/>
         </w:rPr>
-        <w:t xml:space="preserve">: Persons Table -&gt; ID Column: 1, Name_En Column: Motasem Essam] -&gt; </w:t>
+        <w:t xml:space="preserve">: Persons Table -&gt; ID Column: 1, </w:t>
+      </w:r>
+      <w:proofErr w:type="spellStart"/>
+      <w:r>
+        <w:rPr>
+          <w:rFonts w:ascii="Arial" w:eastAsia="Arial" w:hAnsi="Arial" w:cs="Arial"/>
+          <w:color w:val="000000"/>
+          <w:sz w:val="18"/>
+          <w:highlight w:val="lightGray"/>
+        </w:rPr>
+        <w:t>Name_En</w:t>
+      </w:r>
+      <w:proofErr w:type="spellEnd"/>
+      <w:r>
+        <w:rPr>
+          <w:rFonts w:ascii="Arial" w:eastAsia="Arial" w:hAnsi="Arial" w:cs="Arial"/>
+          <w:color w:val="000000"/>
+          <w:sz w:val="18"/>
+          <w:highlight w:val="lightGray"/>
+        </w:rPr>
+        <w:t xml:space="preserve"> Column: Motasem Essam] -&gt; </w:t>
       </w:r>
       <w:r>
         <w:rPr>
@@ -2174,6 +2334,7 @@
           <w:bCs/>
           <w:szCs w:val="26"/>
         </w:rPr>
+        <w:lastRenderedPageBreak/>
         <w:t>✅ Key Features:</w:t>
       </w:r>
     </w:p>
@@ -2526,7 +2687,27 @@
           <w:sz w:val="18"/>
           <w:highlight w:val="lightGray"/>
         </w:rPr>
-        <w:t xml:space="preserve">: Persons Table -&gt; ID Column: 1, Name_En Column: Motasem Essam] -&gt; </w:t>
+        <w:t xml:space="preserve">: Persons Table -&gt; ID Column: 1, </w:t>
+      </w:r>
+      <w:proofErr w:type="spellStart"/>
+      <w:r>
+        <w:rPr>
+          <w:rFonts w:ascii="Arial" w:eastAsia="Arial" w:hAnsi="Arial" w:cs="Arial"/>
+          <w:color w:val="000000"/>
+          <w:sz w:val="18"/>
+          <w:highlight w:val="lightGray"/>
+        </w:rPr>
+        <w:t>Name_En</w:t>
+      </w:r>
+      <w:proofErr w:type="spellEnd"/>
+      <w:r>
+        <w:rPr>
+          <w:rFonts w:ascii="Arial" w:eastAsia="Arial" w:hAnsi="Arial" w:cs="Arial"/>
+          <w:color w:val="000000"/>
+          <w:sz w:val="18"/>
+          <w:highlight w:val="lightGray"/>
+        </w:rPr>
+        <w:t xml:space="preserve"> Column: Motasem Essam] -&gt; </w:t>
       </w:r>
       <w:r>
         <w:rPr>
@@ -2663,6 +2844,7 @@
           <w:b/>
           <w:bCs/>
         </w:rPr>
+        <w:lastRenderedPageBreak/>
         <w:t>Insert-only operations (no updates or deletes)</w:t>
       </w:r>
       <w:r>
@@ -2938,7 +3120,27 @@
           <w:sz w:val="18"/>
           <w:highlight w:val="lightGray"/>
         </w:rPr>
-        <w:t xml:space="preserve">: Persons Table -&gt; ID Column: 1, Name_En Column: Motasem Essam] -&gt; </w:t>
+        <w:t xml:space="preserve">: Persons Table -&gt; ID Column: 1, </w:t>
+      </w:r>
+      <w:proofErr w:type="spellStart"/>
+      <w:r>
+        <w:rPr>
+          <w:rFonts w:ascii="Arial" w:eastAsia="Arial" w:hAnsi="Arial" w:cs="Arial"/>
+          <w:color w:val="000000"/>
+          <w:sz w:val="18"/>
+          <w:highlight w:val="lightGray"/>
+        </w:rPr>
+        <w:t>Name_En</w:t>
+      </w:r>
+      <w:proofErr w:type="spellEnd"/>
+      <w:r>
+        <w:rPr>
+          <w:rFonts w:ascii="Arial" w:eastAsia="Arial" w:hAnsi="Arial" w:cs="Arial"/>
+          <w:color w:val="000000"/>
+          <w:sz w:val="18"/>
+          <w:highlight w:val="lightGray"/>
+        </w:rPr>
+        <w:t xml:space="preserve"> Column: Motasem Essam] -&gt; </w:t>
       </w:r>
       <w:r>
         <w:rPr>
@@ -3124,6 +3326,7 @@
           <w:b/>
           <w:bCs/>
         </w:rPr>
+        <w:lastRenderedPageBreak/>
         <w:t>Logging queries without storage impact</w:t>
       </w:r>
       <w:r>
@@ -3292,7 +3495,27 @@
           <w:sz w:val="18"/>
           <w:highlight w:val="lightGray"/>
         </w:rPr>
-        <w:t xml:space="preserve">: Persons Table -&gt; ID Column: 1, Name_En Column: Motasem Essam] -&gt; </w:t>
+        <w:t xml:space="preserve">: Persons Table -&gt; ID Column: 1, </w:t>
+      </w:r>
+      <w:proofErr w:type="spellStart"/>
+      <w:r>
+        <w:rPr>
+          <w:rFonts w:ascii="Arial" w:eastAsia="Arial" w:hAnsi="Arial" w:cs="Arial"/>
+          <w:color w:val="000000"/>
+          <w:sz w:val="18"/>
+          <w:highlight w:val="lightGray"/>
+        </w:rPr>
+        <w:t>Name_En</w:t>
+      </w:r>
+      <w:proofErr w:type="spellEnd"/>
+      <w:r>
+        <w:rPr>
+          <w:rFonts w:ascii="Arial" w:eastAsia="Arial" w:hAnsi="Arial" w:cs="Arial"/>
+          <w:color w:val="000000"/>
+          <w:sz w:val="18"/>
+          <w:highlight w:val="lightGray"/>
+        </w:rPr>
+        <w:t xml:space="preserve"> Column: Motasem Essam] -&gt; </w:t>
       </w:r>
       <w:r>
         <w:rPr>
@@ -3585,6 +3808,7 @@
           <w:b/>
           <w:bCs/>
         </w:rPr>
+        <w:lastRenderedPageBreak/>
         <w:t>❌ Limited support</w:t>
       </w:r>
       <w:r>
@@ -3653,7 +3877,27 @@
           <w:sz w:val="18"/>
           <w:highlight w:val="lightGray"/>
         </w:rPr>
-        <w:t xml:space="preserve">: Persons Table -&gt; ID Column: 1, Name_En Column: Motasem Essam] -&gt; </w:t>
+        <w:t xml:space="preserve">: Persons Table -&gt; ID Column: 1, </w:t>
+      </w:r>
+      <w:proofErr w:type="spellStart"/>
+      <w:r>
+        <w:rPr>
+          <w:rFonts w:ascii="Arial" w:eastAsia="Arial" w:hAnsi="Arial" w:cs="Arial"/>
+          <w:color w:val="000000"/>
+          <w:sz w:val="18"/>
+          <w:highlight w:val="lightGray"/>
+        </w:rPr>
+        <w:t>Name_En</w:t>
+      </w:r>
+      <w:proofErr w:type="spellEnd"/>
+      <w:r>
+        <w:rPr>
+          <w:rFonts w:ascii="Arial" w:eastAsia="Arial" w:hAnsi="Arial" w:cs="Arial"/>
+          <w:color w:val="000000"/>
+          <w:sz w:val="18"/>
+          <w:highlight w:val="lightGray"/>
+        </w:rPr>
+        <w:t xml:space="preserve"> Column: Motasem Essam] -&gt; </w:t>
       </w:r>
       <w:r>
         <w:rPr>
@@ -4037,6 +4281,7 @@
                 <w:bCs/>
               </w:rPr>
             </w:pPr>
+            <w:proofErr w:type="spellStart"/>
             <w:r>
               <w:rPr>
                 <w:rFonts w:ascii="Roboto Mono" w:eastAsia="Roboto Mono" w:hAnsi="Roboto Mono"/>
@@ -4045,6 +4290,7 @@
               </w:rPr>
               <w:t>InnoDB</w:t>
             </w:r>
+            <w:proofErr w:type="spellEnd"/>
           </w:p>
         </w:tc>
         <w:tc>
@@ -4280,6 +4526,7 @@
                 <w:bCs/>
               </w:rPr>
             </w:pPr>
+            <w:proofErr w:type="spellStart"/>
             <w:r>
               <w:rPr>
                 <w:rFonts w:ascii="Roboto Mono" w:eastAsia="Roboto Mono" w:hAnsi="Roboto Mono"/>
@@ -4288,6 +4535,7 @@
               </w:rPr>
               <w:t>MyISAM</w:t>
             </w:r>
+            <w:proofErr w:type="spellEnd"/>
           </w:p>
         </w:tc>
         <w:tc>
@@ -4529,6 +4777,7 @@
                 <w:b/>
                 <w:bCs/>
               </w:rPr>
+              <w:lastRenderedPageBreak/>
               <w:t>MEMORY</w:t>
             </w:r>
           </w:p>
@@ -5776,7 +6025,27 @@
           <w:sz w:val="18"/>
           <w:highlight w:val="lightGray"/>
         </w:rPr>
-        <w:t xml:space="preserve">: Persons Table -&gt; ID Column: 1, Name_En Column: Motasem Essam] -&gt; </w:t>
+        <w:t xml:space="preserve">: Persons Table -&gt; ID Column: 1, </w:t>
+      </w:r>
+      <w:proofErr w:type="spellStart"/>
+      <w:r>
+        <w:rPr>
+          <w:rFonts w:ascii="Arial" w:eastAsia="Arial" w:hAnsi="Arial" w:cs="Arial"/>
+          <w:color w:val="000000"/>
+          <w:sz w:val="18"/>
+          <w:highlight w:val="lightGray"/>
+        </w:rPr>
+        <w:t>Name_En</w:t>
+      </w:r>
+      <w:proofErr w:type="spellEnd"/>
+      <w:r>
+        <w:rPr>
+          <w:rFonts w:ascii="Arial" w:eastAsia="Arial" w:hAnsi="Arial" w:cs="Arial"/>
+          <w:color w:val="000000"/>
+          <w:sz w:val="18"/>
+          <w:highlight w:val="lightGray"/>
+        </w:rPr>
+        <w:t xml:space="preserve"> Column: Motasem Essam] -&gt; </w:t>
       </w:r>
       <w:r>
         <w:rPr>
@@ -5822,6 +6091,7 @@
         <w:rPr>
           <w:noProof/>
         </w:rPr>
+        <w:lastRenderedPageBreak/>
         <w:drawing>
           <wp:inline distT="114300" distB="114300" distL="114300" distR="114300" wp14:anchorId="7966BC8A" wp14:editId="755BFE01">
             <wp:extent cx="5943600" cy="749300"/>
@@ -5947,7 +6217,27 @@
           <w:sz w:val="18"/>
           <w:highlight w:val="lightGray"/>
         </w:rPr>
-        <w:t xml:space="preserve">: Persons Table -&gt; ID Column: 1, Name_En Column: Motasem Essam] -&gt; </w:t>
+        <w:t xml:space="preserve">: Persons Table -&gt; ID Column: 1, </w:t>
+      </w:r>
+      <w:proofErr w:type="spellStart"/>
+      <w:r>
+        <w:rPr>
+          <w:rFonts w:ascii="Arial" w:eastAsia="Arial" w:hAnsi="Arial" w:cs="Arial"/>
+          <w:color w:val="000000"/>
+          <w:sz w:val="18"/>
+          <w:highlight w:val="lightGray"/>
+        </w:rPr>
+        <w:t>Name_En</w:t>
+      </w:r>
+      <w:proofErr w:type="spellEnd"/>
+      <w:r>
+        <w:rPr>
+          <w:rFonts w:ascii="Arial" w:eastAsia="Arial" w:hAnsi="Arial" w:cs="Arial"/>
+          <w:color w:val="000000"/>
+          <w:sz w:val="18"/>
+          <w:highlight w:val="lightGray"/>
+        </w:rPr>
+        <w:t xml:space="preserve"> Column: Motasem Essam] -&gt; </w:t>
       </w:r>
       <w:r>
         <w:rPr>
@@ -6057,7 +6347,21 @@
         <w:rPr>
           <w:rFonts w:ascii="Roboto Mono" w:eastAsia="Roboto Mono" w:hAnsi="Roboto Mono"/>
         </w:rPr>
-        <w:t xml:space="preserve">    LogID INT,</w:t>
+        <w:t xml:space="preserve">    </w:t>
+      </w:r>
+      <w:proofErr w:type="spellStart"/>
+      <w:r>
+        <w:rPr>
+          <w:rFonts w:ascii="Roboto Mono" w:eastAsia="Roboto Mono" w:hAnsi="Roboto Mono"/>
+        </w:rPr>
+        <w:t>LogID</w:t>
+      </w:r>
+      <w:proofErr w:type="spellEnd"/>
+      <w:r>
+        <w:rPr>
+          <w:rFonts w:ascii="Roboto Mono" w:eastAsia="Roboto Mono" w:hAnsi="Roboto Mono"/>
+        </w:rPr>
+        <w:t xml:space="preserve"> INT,</w:t>
       </w:r>
     </w:p>
     <w:p>
@@ -6101,6 +6405,7 @@
         </w:rPr>
         <w:t xml:space="preserve">, which is usually </w:t>
       </w:r>
+      <w:proofErr w:type="spellStart"/>
       <w:r>
         <w:rPr>
           <w:rFonts w:ascii="Roboto Mono" w:eastAsia="Roboto Mono" w:hAnsi="Roboto Mono"/>
@@ -6109,6 +6414,7 @@
         </w:rPr>
         <w:t>InnoDB</w:t>
       </w:r>
+      <w:proofErr w:type="spellEnd"/>
       <w:r>
         <w:rPr>
           <w:rFonts w:ascii="Roboto Mono" w:eastAsia="Roboto Mono" w:hAnsi="Roboto Mono"/>
@@ -6162,6 +6468,7 @@
           <w:sz w:val="18"/>
           <w:highlight w:val="lightGray"/>
         </w:rPr>
+        <w:lastRenderedPageBreak/>
         <w:t># Source: AI Source: Provided by: [Data Path</w:t>
       </w:r>
       <w:r>
@@ -6171,7 +6478,27 @@
           <w:sz w:val="18"/>
           <w:highlight w:val="lightGray"/>
         </w:rPr>
-        <w:t xml:space="preserve">: Persons Table -&gt; ID Column: 1, Name_En Column: Motasem Essam] -&gt; </w:t>
+        <w:t xml:space="preserve">: Persons Table -&gt; ID Column: 1, </w:t>
+      </w:r>
+      <w:proofErr w:type="spellStart"/>
+      <w:r>
+        <w:rPr>
+          <w:rFonts w:ascii="Arial" w:eastAsia="Arial" w:hAnsi="Arial" w:cs="Arial"/>
+          <w:color w:val="000000"/>
+          <w:sz w:val="18"/>
+          <w:highlight w:val="lightGray"/>
+        </w:rPr>
+        <w:t>Name_En</w:t>
+      </w:r>
+      <w:proofErr w:type="spellEnd"/>
+      <w:r>
+        <w:rPr>
+          <w:rFonts w:ascii="Arial" w:eastAsia="Arial" w:hAnsi="Arial" w:cs="Arial"/>
+          <w:color w:val="000000"/>
+          <w:sz w:val="18"/>
+          <w:highlight w:val="lightGray"/>
+        </w:rPr>
+        <w:t xml:space="preserve"> Column: Motasem Essam] -&gt; </w:t>
       </w:r>
       <w:r>
         <w:rPr>
@@ -6259,7 +6586,21 @@
         <w:rPr>
           <w:rFonts w:ascii="Roboto Mono" w:eastAsia="Roboto Mono" w:hAnsi="Roboto Mono"/>
         </w:rPr>
-        <w:t>ALTER TABLE Customers ENGINE = MyISAM;</w:t>
+        <w:t xml:space="preserve">ALTER TABLE Customers ENGINE = </w:t>
+      </w:r>
+      <w:proofErr w:type="spellStart"/>
+      <w:r>
+        <w:rPr>
+          <w:rFonts w:ascii="Roboto Mono" w:eastAsia="Roboto Mono" w:hAnsi="Roboto Mono"/>
+        </w:rPr>
+        <w:t>MyISAM</w:t>
+      </w:r>
+      <w:proofErr w:type="spellEnd"/>
+      <w:r>
+        <w:rPr>
+          <w:rFonts w:ascii="Roboto Mono" w:eastAsia="Roboto Mono" w:hAnsi="Roboto Mono"/>
+        </w:rPr>
+        <w:t>;</w:t>
       </w:r>
     </w:p>
     <w:p/>
@@ -6317,7 +6658,27 @@
           <w:sz w:val="18"/>
           <w:highlight w:val="lightGray"/>
         </w:rPr>
-        <w:t xml:space="preserve">: Persons Table -&gt; ID Column: 1, Name_En Column: Motasem Essam] -&gt; </w:t>
+        <w:t xml:space="preserve">: Persons Table -&gt; ID Column: 1, </w:t>
+      </w:r>
+      <w:proofErr w:type="spellStart"/>
+      <w:r>
+        <w:rPr>
+          <w:rFonts w:ascii="Arial" w:eastAsia="Arial" w:hAnsi="Arial" w:cs="Arial"/>
+          <w:color w:val="000000"/>
+          <w:sz w:val="18"/>
+          <w:highlight w:val="lightGray"/>
+        </w:rPr>
+        <w:t>Name_En</w:t>
+      </w:r>
+      <w:proofErr w:type="spellEnd"/>
+      <w:r>
+        <w:rPr>
+          <w:rFonts w:ascii="Arial" w:eastAsia="Arial" w:hAnsi="Arial" w:cs="Arial"/>
+          <w:color w:val="000000"/>
+          <w:sz w:val="18"/>
+          <w:highlight w:val="lightGray"/>
+        </w:rPr>
+        <w:t xml:space="preserve"> Column: Motasem Essam] -&gt; </w:t>
       </w:r>
       <w:r>
         <w:rPr>
@@ -6454,7 +6815,27 @@
           <w:sz w:val="18"/>
           <w:highlight w:val="lightGray"/>
         </w:rPr>
-        <w:t xml:space="preserve">: Persons Table -&gt; ID Column: 1, Name_En Column: Motasem Essam] -&gt; </w:t>
+        <w:t xml:space="preserve">: Persons Table -&gt; ID Column: 1, </w:t>
+      </w:r>
+      <w:proofErr w:type="spellStart"/>
+      <w:r>
+        <w:rPr>
+          <w:rFonts w:ascii="Arial" w:eastAsia="Arial" w:hAnsi="Arial" w:cs="Arial"/>
+          <w:color w:val="000000"/>
+          <w:sz w:val="18"/>
+          <w:highlight w:val="lightGray"/>
+        </w:rPr>
+        <w:t>Name_En</w:t>
+      </w:r>
+      <w:proofErr w:type="spellEnd"/>
+      <w:r>
+        <w:rPr>
+          <w:rFonts w:ascii="Arial" w:eastAsia="Arial" w:hAnsi="Arial" w:cs="Arial"/>
+          <w:color w:val="000000"/>
+          <w:sz w:val="18"/>
+          <w:highlight w:val="lightGray"/>
+        </w:rPr>
+        <w:t xml:space="preserve"> Column: Motasem Essam] -&gt; </w:t>
       </w:r>
       <w:r>
         <w:rPr>
@@ -6542,7 +6923,21 @@
         <w:rPr>
           <w:rFonts w:ascii="Roboto Mono" w:eastAsia="Roboto Mono" w:hAnsi="Roboto Mono"/>
         </w:rPr>
-        <w:t>SHOW TABLE STATUS LIKE 'your_table_name';</w:t>
+        <w:t>SHOW TABLE STATUS LIKE '</w:t>
+      </w:r>
+      <w:proofErr w:type="spellStart"/>
+      <w:r>
+        <w:rPr>
+          <w:rFonts w:ascii="Roboto Mono" w:eastAsia="Roboto Mono" w:hAnsi="Roboto Mono"/>
+        </w:rPr>
+        <w:t>your_table_name</w:t>
+      </w:r>
+      <w:proofErr w:type="spellEnd"/>
+      <w:r>
+        <w:rPr>
+          <w:rFonts w:ascii="Roboto Mono" w:eastAsia="Roboto Mono" w:hAnsi="Roboto Mono"/>
+        </w:rPr>
+        <w:t>';</w:t>
       </w:r>
     </w:p>
     <w:p/>
@@ -6571,7 +6966,35 @@
         <w:rPr>
           <w:rFonts w:ascii="Roboto Mono" w:eastAsia="Roboto Mono" w:hAnsi="Roboto Mono"/>
         </w:rPr>
-        <w:t xml:space="preserve"> column in the result to see which engine (e.g., InnoDB, MyISAM) the table uses.</w:t>
+        <w:t xml:space="preserve"> column in the result to see which engine (e.g., </w:t>
+      </w:r>
+      <w:proofErr w:type="spellStart"/>
+      <w:r>
+        <w:rPr>
+          <w:rFonts w:ascii="Roboto Mono" w:eastAsia="Roboto Mono" w:hAnsi="Roboto Mono"/>
+        </w:rPr>
+        <w:t>InnoDB</w:t>
+      </w:r>
+      <w:proofErr w:type="spellEnd"/>
+      <w:r>
+        <w:rPr>
+          <w:rFonts w:ascii="Roboto Mono" w:eastAsia="Roboto Mono" w:hAnsi="Roboto Mono"/>
+        </w:rPr>
+        <w:t xml:space="preserve">, </w:t>
+      </w:r>
+      <w:proofErr w:type="spellStart"/>
+      <w:r>
+        <w:rPr>
+          <w:rFonts w:ascii="Roboto Mono" w:eastAsia="Roboto Mono" w:hAnsi="Roboto Mono"/>
+        </w:rPr>
+        <w:t>MyISAM</w:t>
+      </w:r>
+      <w:proofErr w:type="spellEnd"/>
+      <w:r>
+        <w:rPr>
+          <w:rFonts w:ascii="Roboto Mono" w:eastAsia="Roboto Mono" w:hAnsi="Roboto Mono"/>
+        </w:rPr>
+        <w:t>) the table uses.</w:t>
       </w:r>
       <w:r>
         <w:rPr>
@@ -6613,6 +7036,7 @@
         <w:rPr>
           <w:noProof/>
         </w:rPr>
+        <w:lastRenderedPageBreak/>
         <w:drawing>
           <wp:inline distT="114300" distB="114300" distL="114300" distR="114300" wp14:anchorId="6901A6E5" wp14:editId="7F6C7FB2">
             <wp:extent cx="5943600" cy="673100"/>
@@ -6838,6 +7262,7 @@
             <w:pPr>
               <w:jc w:val="center"/>
             </w:pPr>
+            <w:proofErr w:type="spellStart"/>
             <w:r>
               <w:rPr>
                 <w:rFonts w:ascii="Roboto Mono" w:eastAsia="Roboto Mono" w:hAnsi="Roboto Mono"/>
@@ -6846,6 +7271,7 @@
               </w:rPr>
               <w:t>Row_format</w:t>
             </w:r>
+            <w:proofErr w:type="spellEnd"/>
           </w:p>
         </w:tc>
         <w:tc>
@@ -6955,12 +7381,14 @@
             </w:tcMar>
           </w:tcPr>
           <w:p>
+            <w:proofErr w:type="spellStart"/>
             <w:r>
               <w:rPr>
                 <w:rFonts w:ascii="Roboto Mono" w:eastAsia="Roboto Mono" w:hAnsi="Roboto Mono"/>
               </w:rPr>
               <w:t>InnoDB</w:t>
             </w:r>
+            <w:proofErr w:type="spellEnd"/>
           </w:p>
         </w:tc>
         <w:tc>
@@ -7112,6 +7540,7 @@
         </w:rPr>
         <w:t xml:space="preserve">: Shows </w:t>
       </w:r>
+      <w:proofErr w:type="spellStart"/>
       <w:r>
         <w:rPr>
           <w:rFonts w:ascii="Roboto Mono" w:eastAsia="Roboto Mono" w:hAnsi="Roboto Mono" w:cs="Roboto Mono"/>
@@ -7119,12 +7548,14 @@
         </w:rPr>
         <w:t>InnoDB</w:t>
       </w:r>
+      <w:proofErr w:type="spellEnd"/>
       <w:r>
         <w:rPr>
           <w:rFonts w:ascii="Roboto Mono" w:eastAsia="Roboto Mono" w:hAnsi="Roboto Mono"/>
         </w:rPr>
         <w:t xml:space="preserve">, </w:t>
       </w:r>
+      <w:proofErr w:type="spellStart"/>
       <w:r>
         <w:rPr>
           <w:rFonts w:ascii="Roboto Mono" w:eastAsia="Roboto Mono" w:hAnsi="Roboto Mono" w:cs="Roboto Mono"/>
@@ -7132,6 +7563,7 @@
         </w:rPr>
         <w:t>MyISAM</w:t>
       </w:r>
+      <w:proofErr w:type="spellEnd"/>
       <w:r>
         <w:rPr>
           <w:rFonts w:ascii="Roboto Mono" w:eastAsia="Roboto Mono" w:hAnsi="Roboto Mono"/>
@@ -7153,6 +7585,7 @@
         </w:numPr>
         <w:spacing w:after="240" w:line="276" w:lineRule="auto"/>
       </w:pPr>
+      <w:proofErr w:type="spellStart"/>
       <w:r>
         <w:rPr>
           <w:rFonts w:ascii="Roboto Mono" w:eastAsia="Roboto Mono" w:hAnsi="Roboto Mono" w:cs="Roboto Mono"/>
@@ -7160,6 +7593,7 @@
         </w:rPr>
         <w:t>Row_format</w:t>
       </w:r>
+      <w:proofErr w:type="spellEnd"/>
       <w:r>
         <w:rPr>
           <w:rFonts w:ascii="Roboto Mono" w:eastAsia="Roboto Mono" w:hAnsi="Roboto Mono"/>
@@ -7265,7 +7699,27 @@
           <w:sz w:val="18"/>
           <w:highlight w:val="lightGray"/>
         </w:rPr>
-        <w:t xml:space="preserve">: Persons Table -&gt; ID Column: 1, Name_En Column: Motasem Essam] -&gt; </w:t>
+        <w:t xml:space="preserve">: Persons Table -&gt; ID Column: 1, </w:t>
+      </w:r>
+      <w:proofErr w:type="spellStart"/>
+      <w:r>
+        <w:rPr>
+          <w:rFonts w:ascii="Arial" w:eastAsia="Arial" w:hAnsi="Arial" w:cs="Arial"/>
+          <w:color w:val="000000"/>
+          <w:sz w:val="18"/>
+          <w:highlight w:val="lightGray"/>
+        </w:rPr>
+        <w:t>Name_En</w:t>
+      </w:r>
+      <w:proofErr w:type="spellEnd"/>
+      <w:r>
+        <w:rPr>
+          <w:rFonts w:ascii="Arial" w:eastAsia="Arial" w:hAnsi="Arial" w:cs="Arial"/>
+          <w:color w:val="000000"/>
+          <w:sz w:val="18"/>
+          <w:highlight w:val="lightGray"/>
+        </w:rPr>
+        <w:t xml:space="preserve"> Column: Motasem Essam] -&gt; </w:t>
       </w:r>
       <w:r>
         <w:rPr>
@@ -7311,6 +7765,7 @@
         <w:rPr>
           <w:noProof/>
         </w:rPr>
+        <w:lastRenderedPageBreak/>
         <w:drawing>
           <wp:inline distT="114300" distB="114300" distL="114300" distR="114300" wp14:anchorId="58FC9AAC" wp14:editId="6DC6AB6C">
             <wp:extent cx="5943600" cy="1219200"/>
@@ -7369,15 +7824,43 @@
         <w:rPr>
           <w:rFonts w:ascii="Roboto Mono" w:eastAsia="Roboto Mono" w:hAnsi="Roboto Mono"/>
         </w:rPr>
-        <w:t>WHERE TABLE_SCHEMA = 'your_database_name'</w:t>
-      </w:r>
-    </w:p>
-    <w:p>
-      <w:r>
-        <w:rPr>
-          <w:rFonts w:ascii="Roboto Mono" w:eastAsia="Roboto Mono" w:hAnsi="Roboto Mono"/>
-        </w:rPr>
-        <w:t xml:space="preserve">  AND TABLE_NAME = 'your_table_name';</w:t>
+        <w:t>WHERE TABLE_SCHEMA = '</w:t>
+      </w:r>
+      <w:proofErr w:type="spellStart"/>
+      <w:r>
+        <w:rPr>
+          <w:rFonts w:ascii="Roboto Mono" w:eastAsia="Roboto Mono" w:hAnsi="Roboto Mono"/>
+        </w:rPr>
+        <w:t>your_database_name</w:t>
+      </w:r>
+      <w:proofErr w:type="spellEnd"/>
+      <w:r>
+        <w:rPr>
+          <w:rFonts w:ascii="Roboto Mono" w:eastAsia="Roboto Mono" w:hAnsi="Roboto Mono"/>
+        </w:rPr>
+        <w:t>'</w:t>
+      </w:r>
+    </w:p>
+    <w:p>
+      <w:r>
+        <w:rPr>
+          <w:rFonts w:ascii="Roboto Mono" w:eastAsia="Roboto Mono" w:hAnsi="Roboto Mono"/>
+        </w:rPr>
+        <w:t xml:space="preserve">  AND TABLE_NAME = '</w:t>
+      </w:r>
+      <w:proofErr w:type="spellStart"/>
+      <w:r>
+        <w:rPr>
+          <w:rFonts w:ascii="Roboto Mono" w:eastAsia="Roboto Mono" w:hAnsi="Roboto Mono"/>
+        </w:rPr>
+        <w:t>your_table_name</w:t>
+      </w:r>
+      <w:proofErr w:type="spellEnd"/>
+      <w:r>
+        <w:rPr>
+          <w:rFonts w:ascii="Roboto Mono" w:eastAsia="Roboto Mono" w:hAnsi="Roboto Mono"/>
+        </w:rPr>
+        <w:t>';</w:t>
       </w:r>
     </w:p>
     <w:p/>
@@ -7472,7 +7955,21 @@
         <w:rPr>
           <w:rFonts w:ascii="Roboto Mono" w:eastAsia="Roboto Mono" w:hAnsi="Roboto Mono"/>
         </w:rPr>
-        <w:t>WHERE TABLE_SCHEMA = 'testdb'</w:t>
+        <w:t>WHERE TABLE_SCHEMA = '</w:t>
+      </w:r>
+      <w:proofErr w:type="spellStart"/>
+      <w:r>
+        <w:rPr>
+          <w:rFonts w:ascii="Roboto Mono" w:eastAsia="Roboto Mono" w:hAnsi="Roboto Mono"/>
+        </w:rPr>
+        <w:t>testdb</w:t>
+      </w:r>
+      <w:proofErr w:type="spellEnd"/>
+      <w:r>
+        <w:rPr>
+          <w:rFonts w:ascii="Roboto Mono" w:eastAsia="Roboto Mono" w:hAnsi="Roboto Mono"/>
+        </w:rPr>
+        <w:t>'</w:t>
       </w:r>
     </w:p>
     <w:p>
@@ -7575,6 +8072,7 @@
                 <w:b/>
                 <w:bCs/>
               </w:rPr>
+              <w:lastRenderedPageBreak/>
               <w:t>TABLE_NAME</w:t>
             </w:r>
           </w:p>
@@ -7656,12 +8154,14 @@
             </w:tcMar>
           </w:tcPr>
           <w:p>
+            <w:proofErr w:type="spellStart"/>
             <w:r>
               <w:rPr>
                 <w:rFonts w:ascii="Roboto Mono" w:eastAsia="Roboto Mono" w:hAnsi="Roboto Mono"/>
               </w:rPr>
               <w:t>InnoDB</w:t>
             </w:r>
+            <w:proofErr w:type="spellEnd"/>
           </w:p>
         </w:tc>
       </w:tr>
@@ -7738,7 +8238,27 @@
           <w:sz w:val="18"/>
           <w:highlight w:val="lightGray"/>
         </w:rPr>
-        <w:t xml:space="preserve">: Persons Table -&gt; ID Column: 1, Name_En Column: Motasem Essam] -&gt; </w:t>
+        <w:t xml:space="preserve">: Persons Table -&gt; ID Column: 1, </w:t>
+      </w:r>
+      <w:proofErr w:type="spellStart"/>
+      <w:r>
+        <w:rPr>
+          <w:rFonts w:ascii="Arial" w:eastAsia="Arial" w:hAnsi="Arial" w:cs="Arial"/>
+          <w:color w:val="000000"/>
+          <w:sz w:val="18"/>
+          <w:highlight w:val="lightGray"/>
+        </w:rPr>
+        <w:t>Name_En</w:t>
+      </w:r>
+      <w:proofErr w:type="spellEnd"/>
+      <w:r>
+        <w:rPr>
+          <w:rFonts w:ascii="Arial" w:eastAsia="Arial" w:hAnsi="Arial" w:cs="Arial"/>
+          <w:color w:val="000000"/>
+          <w:sz w:val="18"/>
+          <w:highlight w:val="lightGray"/>
+        </w:rPr>
+        <w:t xml:space="preserve"> Column: Motasem Essam] -&gt; </w:t>
       </w:r>
       <w:r>
         <w:rPr>
@@ -7826,7 +8346,21 @@
         <w:rPr>
           <w:rFonts w:ascii="Roboto Mono" w:eastAsia="Roboto Mono" w:hAnsi="Roboto Mono"/>
         </w:rPr>
-        <w:t>SHOW CREATE TABLE your_table_name;</w:t>
+        <w:t xml:space="preserve">SHOW CREATE TABLE </w:t>
+      </w:r>
+      <w:proofErr w:type="spellStart"/>
+      <w:r>
+        <w:rPr>
+          <w:rFonts w:ascii="Roboto Mono" w:eastAsia="Roboto Mono" w:hAnsi="Roboto Mono"/>
+        </w:rPr>
+        <w:t>your_table_name</w:t>
+      </w:r>
+      <w:proofErr w:type="spellEnd"/>
+      <w:r>
+        <w:rPr>
+          <w:rFonts w:ascii="Roboto Mono" w:eastAsia="Roboto Mono" w:hAnsi="Roboto Mono"/>
+        </w:rPr>
+        <w:t>;</w:t>
       </w:r>
     </w:p>
     <w:p/>
@@ -7937,31 +8471,101 @@
         <w:rPr>
           <w:rFonts w:ascii="Roboto Mono" w:eastAsia="Roboto Mono" w:hAnsi="Roboto Mono"/>
         </w:rPr>
-        <w:t xml:space="preserve">  `CustomerID` int NOT NULL,</w:t>
-      </w:r>
-    </w:p>
-    <w:p>
-      <w:r>
-        <w:rPr>
-          <w:rFonts w:ascii="Roboto Mono" w:eastAsia="Roboto Mono" w:hAnsi="Roboto Mono"/>
-        </w:rPr>
-        <w:t xml:space="preserve">  `CustomerName` varchar(100) DEFAULT NULL,</w:t>
-      </w:r>
-    </w:p>
-    <w:p>
-      <w:r>
-        <w:rPr>
-          <w:rFonts w:ascii="Roboto Mono" w:eastAsia="Roboto Mono" w:hAnsi="Roboto Mono"/>
-        </w:rPr>
-        <w:t xml:space="preserve">  PRIMARY KEY (`CustomerID`)</w:t>
-      </w:r>
-    </w:p>
-    <w:p>
-      <w:r>
-        <w:rPr>
-          <w:rFonts w:ascii="Roboto Mono" w:eastAsia="Roboto Mono" w:hAnsi="Roboto Mono"/>
-        </w:rPr>
-        <w:t>) ENGINE=InnoDB DEFAULT CHARSET=utf8mb4;</w:t>
+        <w:t xml:space="preserve">  `</w:t>
+      </w:r>
+      <w:proofErr w:type="spellStart"/>
+      <w:r>
+        <w:rPr>
+          <w:rFonts w:ascii="Roboto Mono" w:eastAsia="Roboto Mono" w:hAnsi="Roboto Mono"/>
+        </w:rPr>
+        <w:t>CustomerID</w:t>
+      </w:r>
+      <w:proofErr w:type="spellEnd"/>
+      <w:r>
+        <w:rPr>
+          <w:rFonts w:ascii="Roboto Mono" w:eastAsia="Roboto Mono" w:hAnsi="Roboto Mono"/>
+        </w:rPr>
+        <w:t>` int NOT NULL,</w:t>
+      </w:r>
+    </w:p>
+    <w:p>
+      <w:r>
+        <w:rPr>
+          <w:rFonts w:ascii="Roboto Mono" w:eastAsia="Roboto Mono" w:hAnsi="Roboto Mono"/>
+        </w:rPr>
+        <w:t xml:space="preserve">  `</w:t>
+      </w:r>
+      <w:proofErr w:type="spellStart"/>
+      <w:r>
+        <w:rPr>
+          <w:rFonts w:ascii="Roboto Mono" w:eastAsia="Roboto Mono" w:hAnsi="Roboto Mono"/>
+        </w:rPr>
+        <w:t>CustomerName</w:t>
+      </w:r>
+      <w:proofErr w:type="spellEnd"/>
+      <w:r>
+        <w:rPr>
+          <w:rFonts w:ascii="Roboto Mono" w:eastAsia="Roboto Mono" w:hAnsi="Roboto Mono"/>
+        </w:rPr>
+        <w:t xml:space="preserve">` </w:t>
+      </w:r>
+      <w:proofErr w:type="gramStart"/>
+      <w:r>
+        <w:rPr>
+          <w:rFonts w:ascii="Roboto Mono" w:eastAsia="Roboto Mono" w:hAnsi="Roboto Mono"/>
+        </w:rPr>
+        <w:t>varchar(</w:t>
+      </w:r>
+      <w:proofErr w:type="gramEnd"/>
+      <w:r>
+        <w:rPr>
+          <w:rFonts w:ascii="Roboto Mono" w:eastAsia="Roboto Mono" w:hAnsi="Roboto Mono"/>
+        </w:rPr>
+        <w:t>100) DEFAULT NULL,</w:t>
+      </w:r>
+    </w:p>
+    <w:p>
+      <w:r>
+        <w:rPr>
+          <w:rFonts w:ascii="Roboto Mono" w:eastAsia="Roboto Mono" w:hAnsi="Roboto Mono"/>
+        </w:rPr>
+        <w:t xml:space="preserve">  PRIMARY KEY (`</w:t>
+      </w:r>
+      <w:proofErr w:type="spellStart"/>
+      <w:r>
+        <w:rPr>
+          <w:rFonts w:ascii="Roboto Mono" w:eastAsia="Roboto Mono" w:hAnsi="Roboto Mono"/>
+        </w:rPr>
+        <w:t>CustomerID</w:t>
+      </w:r>
+      <w:proofErr w:type="spellEnd"/>
+      <w:r>
+        <w:rPr>
+          <w:rFonts w:ascii="Roboto Mono" w:eastAsia="Roboto Mono" w:hAnsi="Roboto Mono"/>
+        </w:rPr>
+        <w:t>`)</w:t>
+      </w:r>
+    </w:p>
+    <w:p>
+      <w:r>
+        <w:rPr>
+          <w:rFonts w:ascii="Roboto Mono" w:eastAsia="Roboto Mono" w:hAnsi="Roboto Mono"/>
+        </w:rPr>
+        <w:t>) ENGINE=</w:t>
+      </w:r>
+      <w:proofErr w:type="spellStart"/>
+      <w:r>
+        <w:rPr>
+          <w:rFonts w:ascii="Roboto Mono" w:eastAsia="Roboto Mono" w:hAnsi="Roboto Mono"/>
+        </w:rPr>
+        <w:t>InnoDB</w:t>
+      </w:r>
+      <w:proofErr w:type="spellEnd"/>
+      <w:r>
+        <w:rPr>
+          <w:rFonts w:ascii="Roboto Mono" w:eastAsia="Roboto Mono" w:hAnsi="Roboto Mono"/>
+        </w:rPr>
+        <w:t xml:space="preserve"> DEFAULT CHARSET=utf8mb4;</w:t>
       </w:r>
     </w:p>
     <w:p/>
@@ -8021,7 +8625,27 @@
           <w:sz w:val="18"/>
           <w:highlight w:val="lightGray"/>
         </w:rPr>
-        <w:t xml:space="preserve">: Persons Table -&gt; ID Column: 1, Name_En Column: Motasem Essam] -&gt; </w:t>
+        <w:t xml:space="preserve">: Persons Table -&gt; ID Column: 1, </w:t>
+      </w:r>
+      <w:proofErr w:type="spellStart"/>
+      <w:r>
+        <w:rPr>
+          <w:rFonts w:ascii="Arial" w:eastAsia="Arial" w:hAnsi="Arial" w:cs="Arial"/>
+          <w:color w:val="000000"/>
+          <w:sz w:val="18"/>
+          <w:highlight w:val="lightGray"/>
+        </w:rPr>
+        <w:t>Name_En</w:t>
+      </w:r>
+      <w:proofErr w:type="spellEnd"/>
+      <w:r>
+        <w:rPr>
+          <w:rFonts w:ascii="Arial" w:eastAsia="Arial" w:hAnsi="Arial" w:cs="Arial"/>
+          <w:color w:val="000000"/>
+          <w:sz w:val="18"/>
+          <w:highlight w:val="lightGray"/>
+        </w:rPr>
+        <w:t xml:space="preserve"> Column: Motasem Essam] -&gt; </w:t>
       </w:r>
       <w:r>
         <w:rPr>
@@ -8147,6 +8771,7 @@
             <w:pPr>
               <w:jc w:val="center"/>
             </w:pPr>
+            <w:proofErr w:type="spellStart"/>
             <w:r>
               <w:rPr>
                 <w:rFonts w:ascii="Roboto Mono" w:eastAsia="Roboto Mono" w:hAnsi="Roboto Mono"/>
@@ -8155,6 +8780,7 @@
               </w:rPr>
               <w:t>InnoDB</w:t>
             </w:r>
+            <w:proofErr w:type="spellEnd"/>
           </w:p>
         </w:tc>
         <w:tc>
@@ -8177,6 +8803,7 @@
             <w:pPr>
               <w:jc w:val="center"/>
             </w:pPr>
+            <w:proofErr w:type="spellStart"/>
             <w:r>
               <w:rPr>
                 <w:rFonts w:ascii="Roboto Mono" w:eastAsia="Roboto Mono" w:hAnsi="Roboto Mono"/>
@@ -8185,6 +8812,7 @@
               </w:rPr>
               <w:t>MyISAM</w:t>
             </w:r>
+            <w:proofErr w:type="spellEnd"/>
           </w:p>
         </w:tc>
         <w:tc>
@@ -8906,8 +9534,20 @@
           <w:sz w:val="18"/>
           <w:highlight w:val="lightGray"/>
         </w:rPr>
-        <w:t># Source: ScreenShot</w:t>
-      </w:r>
+        <w:t xml:space="preserve"># Source: </w:t>
+      </w:r>
+      <w:proofErr w:type="spellStart"/>
+      <w:r>
+        <w:rPr>
+          <w:rFonts w:ascii="Arial" w:eastAsia="Arial" w:hAnsi="Arial" w:cs="Arial"/>
+          <w:b/>
+          <w:color w:val="000000"/>
+          <w:sz w:val="18"/>
+          <w:highlight w:val="lightGray"/>
+        </w:rPr>
+        <w:t>ScreenShot</w:t>
+      </w:r>
+      <w:proofErr w:type="spellEnd"/>
       <w:r>
         <w:rPr>
           <w:rFonts w:ascii="Arial" w:eastAsia="Arial" w:hAnsi="Arial" w:cs="Arial"/>
@@ -8953,7 +9593,27 @@
           <w:sz w:val="18"/>
           <w:highlight w:val="lightGray"/>
         </w:rPr>
-        <w:t xml:space="preserve"> [Persons Table -&gt; ID Column: 1, Name_En Column: Motasem Essam] -&gt; </w:t>
+        <w:t xml:space="preserve"> [Persons Table -&gt; ID Column: 1, </w:t>
+      </w:r>
+      <w:proofErr w:type="spellStart"/>
+      <w:r>
+        <w:rPr>
+          <w:rFonts w:ascii="Arial" w:eastAsia="Arial" w:hAnsi="Arial" w:cs="Arial"/>
+          <w:color w:val="000000"/>
+          <w:sz w:val="18"/>
+          <w:highlight w:val="lightGray"/>
+        </w:rPr>
+        <w:t>Name_En</w:t>
+      </w:r>
+      <w:proofErr w:type="spellEnd"/>
+      <w:r>
+        <w:rPr>
+          <w:rFonts w:ascii="Arial" w:eastAsia="Arial" w:hAnsi="Arial" w:cs="Arial"/>
+          <w:color w:val="000000"/>
+          <w:sz w:val="18"/>
+          <w:highlight w:val="lightGray"/>
+        </w:rPr>
+        <w:t xml:space="preserve"> Column: Motasem Essam] -&gt; </w:t>
       </w:r>
       <w:r>
         <w:rPr>
@@ -8972,7 +9632,27 @@
           <w:sz w:val="18"/>
           <w:highlight w:val="lightGray"/>
         </w:rPr>
-        <w:t xml:space="preserve"> [Automation Table -&gt; ID Column: 16, Name_En Column: Screen Capture] -&gt; </w:t>
+        <w:t xml:space="preserve"> [Automation Table -&gt; ID Column: 16, </w:t>
+      </w:r>
+      <w:proofErr w:type="spellStart"/>
+      <w:r>
+        <w:rPr>
+          <w:rFonts w:ascii="Arial" w:eastAsia="Arial" w:hAnsi="Arial" w:cs="Arial"/>
+          <w:color w:val="000000"/>
+          <w:sz w:val="18"/>
+          <w:highlight w:val="lightGray"/>
+        </w:rPr>
+        <w:t>Name_En</w:t>
+      </w:r>
+      <w:proofErr w:type="spellEnd"/>
+      <w:r>
+        <w:rPr>
+          <w:rFonts w:ascii="Arial" w:eastAsia="Arial" w:hAnsi="Arial" w:cs="Arial"/>
+          <w:color w:val="000000"/>
+          <w:sz w:val="18"/>
+          <w:highlight w:val="lightGray"/>
+        </w:rPr>
+        <w:t xml:space="preserve"> Column: Screen Capture] -&gt; </w:t>
       </w:r>
       <w:r>
         <w:rPr>
@@ -8991,7 +9671,27 @@
           <w:sz w:val="18"/>
           <w:highlight w:val="lightGray"/>
         </w:rPr>
-        <w:t xml:space="preserve">[Operating System: Wampserver64 -&gt; phpmyadmin] </w:t>
+        <w:t xml:space="preserve">[Operating System: Wampserver64 -&gt; </w:t>
+      </w:r>
+      <w:proofErr w:type="spellStart"/>
+      <w:r>
+        <w:rPr>
+          <w:rFonts w:ascii="Arial" w:eastAsia="Arial" w:hAnsi="Arial" w:cs="Arial"/>
+          <w:color w:val="000000"/>
+          <w:sz w:val="18"/>
+          <w:highlight w:val="lightGray"/>
+        </w:rPr>
+        <w:t>phpmyadmin</w:t>
+      </w:r>
+      <w:proofErr w:type="spellEnd"/>
+      <w:r>
+        <w:rPr>
+          <w:rFonts w:ascii="Arial" w:eastAsia="Arial" w:hAnsi="Arial" w:cs="Arial"/>
+          <w:color w:val="000000"/>
+          <w:sz w:val="18"/>
+          <w:highlight w:val="lightGray"/>
+        </w:rPr>
+        <w:t xml:space="preserve">] </w:t>
       </w:r>
       <w:r>
         <w:rPr>
@@ -9060,7 +9760,21 @@
         <w:rPr>
           <w:rFonts w:ascii="Roboto Mono" w:eastAsia="Roboto Mono" w:hAnsi="Roboto Mono"/>
         </w:rPr>
-        <w:t>CREATE DATABASE testDB;</w:t>
+        <w:t xml:space="preserve">CREATE DATABASE </w:t>
+      </w:r>
+      <w:proofErr w:type="spellStart"/>
+      <w:r>
+        <w:rPr>
+          <w:rFonts w:ascii="Roboto Mono" w:eastAsia="Roboto Mono" w:hAnsi="Roboto Mono"/>
+        </w:rPr>
+        <w:t>testDB</w:t>
+      </w:r>
+      <w:proofErr w:type="spellEnd"/>
+      <w:r>
+        <w:rPr>
+          <w:rFonts w:ascii="Roboto Mono" w:eastAsia="Roboto Mono" w:hAnsi="Roboto Mono"/>
+        </w:rPr>
+        <w:t>;</w:t>
       </w:r>
     </w:p>
     <w:p>
@@ -9112,6 +9826,7 @@
       <w:bookmarkStart w:id="22" w:name="_2vfh0gfl8kkk" w:colFirst="0" w:colLast="0"/>
       <w:bookmarkEnd w:id="22"/>
       <w:r>
+        <w:lastRenderedPageBreak/>
         <w:t>basic command</w:t>
       </w:r>
     </w:p>
@@ -9134,8 +9849,20 @@
           <w:sz w:val="18"/>
           <w:highlight w:val="lightGray"/>
         </w:rPr>
-        <w:t># Source: ScreenShot</w:t>
-      </w:r>
+        <w:t xml:space="preserve"># Source: </w:t>
+      </w:r>
+      <w:proofErr w:type="spellStart"/>
+      <w:r>
+        <w:rPr>
+          <w:rFonts w:ascii="Arial" w:eastAsia="Arial" w:hAnsi="Arial" w:cs="Arial"/>
+          <w:b/>
+          <w:color w:val="000000"/>
+          <w:sz w:val="18"/>
+          <w:highlight w:val="lightGray"/>
+        </w:rPr>
+        <w:t>ScreenShot</w:t>
+      </w:r>
+      <w:proofErr w:type="spellEnd"/>
       <w:r>
         <w:rPr>
           <w:rFonts w:ascii="Arial" w:eastAsia="Arial" w:hAnsi="Arial" w:cs="Arial"/>
@@ -9181,7 +9908,27 @@
           <w:sz w:val="18"/>
           <w:highlight w:val="lightGray"/>
         </w:rPr>
-        <w:t xml:space="preserve"> [Persons Table -&gt; ID Column: 1, Name_En Column: Motasem Essam] -&gt; </w:t>
+        <w:t xml:space="preserve"> [Persons Table -&gt; ID Column: 1, </w:t>
+      </w:r>
+      <w:proofErr w:type="spellStart"/>
+      <w:r>
+        <w:rPr>
+          <w:rFonts w:ascii="Arial" w:eastAsia="Arial" w:hAnsi="Arial" w:cs="Arial"/>
+          <w:color w:val="000000"/>
+          <w:sz w:val="18"/>
+          <w:highlight w:val="lightGray"/>
+        </w:rPr>
+        <w:t>Name_En</w:t>
+      </w:r>
+      <w:proofErr w:type="spellEnd"/>
+      <w:r>
+        <w:rPr>
+          <w:rFonts w:ascii="Arial" w:eastAsia="Arial" w:hAnsi="Arial" w:cs="Arial"/>
+          <w:color w:val="000000"/>
+          <w:sz w:val="18"/>
+          <w:highlight w:val="lightGray"/>
+        </w:rPr>
+        <w:t xml:space="preserve"> Column: Motasem Essam] -&gt; </w:t>
       </w:r>
       <w:r>
         <w:rPr>
@@ -9200,7 +9947,27 @@
           <w:sz w:val="18"/>
           <w:highlight w:val="lightGray"/>
         </w:rPr>
-        <w:t xml:space="preserve"> [Automation Table -&gt; ID Column: 16, Name_En Column: Screen Capture] -&gt; </w:t>
+        <w:t xml:space="preserve"> [Automation Table -&gt; ID Column: 16, </w:t>
+      </w:r>
+      <w:proofErr w:type="spellStart"/>
+      <w:r>
+        <w:rPr>
+          <w:rFonts w:ascii="Arial" w:eastAsia="Arial" w:hAnsi="Arial" w:cs="Arial"/>
+          <w:color w:val="000000"/>
+          <w:sz w:val="18"/>
+          <w:highlight w:val="lightGray"/>
+        </w:rPr>
+        <w:t>Name_En</w:t>
+      </w:r>
+      <w:proofErr w:type="spellEnd"/>
+      <w:r>
+        <w:rPr>
+          <w:rFonts w:ascii="Arial" w:eastAsia="Arial" w:hAnsi="Arial" w:cs="Arial"/>
+          <w:color w:val="000000"/>
+          <w:sz w:val="18"/>
+          <w:highlight w:val="lightGray"/>
+        </w:rPr>
+        <w:t xml:space="preserve"> Column: Screen Capture] -&gt; </w:t>
       </w:r>
       <w:r>
         <w:rPr>
@@ -9219,7 +9986,27 @@
           <w:sz w:val="18"/>
           <w:highlight w:val="lightGray"/>
         </w:rPr>
-        <w:t xml:space="preserve">[Operating System: Wampserver64 -&gt; phpmyadmin] </w:t>
+        <w:t xml:space="preserve">[Operating System: Wampserver64 -&gt; </w:t>
+      </w:r>
+      <w:proofErr w:type="spellStart"/>
+      <w:r>
+        <w:rPr>
+          <w:rFonts w:ascii="Arial" w:eastAsia="Arial" w:hAnsi="Arial" w:cs="Arial"/>
+          <w:color w:val="000000"/>
+          <w:sz w:val="18"/>
+          <w:highlight w:val="lightGray"/>
+        </w:rPr>
+        <w:t>phpmyadmin</w:t>
+      </w:r>
+      <w:proofErr w:type="spellEnd"/>
+      <w:r>
+        <w:rPr>
+          <w:rFonts w:ascii="Arial" w:eastAsia="Arial" w:hAnsi="Arial" w:cs="Arial"/>
+          <w:color w:val="000000"/>
+          <w:sz w:val="18"/>
+          <w:highlight w:val="lightGray"/>
+        </w:rPr>
+        <w:t xml:space="preserve">] </w:t>
       </w:r>
       <w:r>
         <w:rPr>
@@ -9371,8 +10158,20 @@
           <w:sz w:val="18"/>
           <w:highlight w:val="lightGray"/>
         </w:rPr>
-        <w:t># Source: ScreenShot</w:t>
-      </w:r>
+        <w:t xml:space="preserve"># Source: </w:t>
+      </w:r>
+      <w:proofErr w:type="spellStart"/>
+      <w:r>
+        <w:rPr>
+          <w:rFonts w:ascii="Arial" w:eastAsia="Arial" w:hAnsi="Arial" w:cs="Arial"/>
+          <w:b/>
+          <w:color w:val="000000"/>
+          <w:sz w:val="18"/>
+          <w:highlight w:val="lightGray"/>
+        </w:rPr>
+        <w:t>ScreenShot</w:t>
+      </w:r>
+      <w:proofErr w:type="spellEnd"/>
       <w:r>
         <w:rPr>
           <w:rFonts w:ascii="Arial" w:eastAsia="Arial" w:hAnsi="Arial" w:cs="Arial"/>
@@ -9418,7 +10217,27 @@
           <w:sz w:val="18"/>
           <w:highlight w:val="lightGray"/>
         </w:rPr>
-        <w:t xml:space="preserve"> [Persons Table -&gt; ID Column: 1, Name_En Column: Motasem Essam] -&gt; </w:t>
+        <w:t xml:space="preserve"> [Persons Table -&gt; ID Column: 1, </w:t>
+      </w:r>
+      <w:proofErr w:type="spellStart"/>
+      <w:r>
+        <w:rPr>
+          <w:rFonts w:ascii="Arial" w:eastAsia="Arial" w:hAnsi="Arial" w:cs="Arial"/>
+          <w:color w:val="000000"/>
+          <w:sz w:val="18"/>
+          <w:highlight w:val="lightGray"/>
+        </w:rPr>
+        <w:t>Name_En</w:t>
+      </w:r>
+      <w:proofErr w:type="spellEnd"/>
+      <w:r>
+        <w:rPr>
+          <w:rFonts w:ascii="Arial" w:eastAsia="Arial" w:hAnsi="Arial" w:cs="Arial"/>
+          <w:color w:val="000000"/>
+          <w:sz w:val="18"/>
+          <w:highlight w:val="lightGray"/>
+        </w:rPr>
+        <w:t xml:space="preserve"> Column: Motasem Essam] -&gt; </w:t>
       </w:r>
       <w:r>
         <w:rPr>
@@ -9437,7 +10256,27 @@
           <w:sz w:val="18"/>
           <w:highlight w:val="lightGray"/>
         </w:rPr>
-        <w:t xml:space="preserve"> [Automation Table -&gt; ID Column: 16, Name_En Column: Screen Capture] -&gt; </w:t>
+        <w:t xml:space="preserve"> [Automation Table -&gt; ID Column: 16, </w:t>
+      </w:r>
+      <w:proofErr w:type="spellStart"/>
+      <w:r>
+        <w:rPr>
+          <w:rFonts w:ascii="Arial" w:eastAsia="Arial" w:hAnsi="Arial" w:cs="Arial"/>
+          <w:color w:val="000000"/>
+          <w:sz w:val="18"/>
+          <w:highlight w:val="lightGray"/>
+        </w:rPr>
+        <w:t>Name_En</w:t>
+      </w:r>
+      <w:proofErr w:type="spellEnd"/>
+      <w:r>
+        <w:rPr>
+          <w:rFonts w:ascii="Arial" w:eastAsia="Arial" w:hAnsi="Arial" w:cs="Arial"/>
+          <w:color w:val="000000"/>
+          <w:sz w:val="18"/>
+          <w:highlight w:val="lightGray"/>
+        </w:rPr>
+        <w:t xml:space="preserve"> Column: Screen Capture] -&gt; </w:t>
       </w:r>
       <w:r>
         <w:rPr>
@@ -9456,7 +10295,27 @@
           <w:sz w:val="18"/>
           <w:highlight w:val="lightGray"/>
         </w:rPr>
-        <w:t xml:space="preserve">[Operating System: Wampserver64 -&gt; phpmyadmin] </w:t>
+        <w:t xml:space="preserve">[Operating System: Wampserver64 -&gt; </w:t>
+      </w:r>
+      <w:proofErr w:type="spellStart"/>
+      <w:r>
+        <w:rPr>
+          <w:rFonts w:ascii="Arial" w:eastAsia="Arial" w:hAnsi="Arial" w:cs="Arial"/>
+          <w:color w:val="000000"/>
+          <w:sz w:val="18"/>
+          <w:highlight w:val="lightGray"/>
+        </w:rPr>
+        <w:t>phpmyadmin</w:t>
+      </w:r>
+      <w:proofErr w:type="spellEnd"/>
+      <w:r>
+        <w:rPr>
+          <w:rFonts w:ascii="Arial" w:eastAsia="Arial" w:hAnsi="Arial" w:cs="Arial"/>
+          <w:color w:val="000000"/>
+          <w:sz w:val="18"/>
+          <w:highlight w:val="lightGray"/>
+        </w:rPr>
+        <w:t xml:space="preserve">] </w:t>
       </w:r>
       <w:r>
         <w:rPr>
@@ -9533,7 +10392,21 @@
         <w:rPr>
           <w:rFonts w:ascii="Roboto Mono" w:eastAsia="Roboto Mono" w:hAnsi="Roboto Mono"/>
         </w:rPr>
-        <w:t xml:space="preserve">    LogID INT,</w:t>
+        <w:t xml:space="preserve">    </w:t>
+      </w:r>
+      <w:proofErr w:type="spellStart"/>
+      <w:r>
+        <w:rPr>
+          <w:rFonts w:ascii="Roboto Mono" w:eastAsia="Roboto Mono" w:hAnsi="Roboto Mono"/>
+        </w:rPr>
+        <w:t>LogID</w:t>
+      </w:r>
+      <w:proofErr w:type="spellEnd"/>
+      <w:r>
+        <w:rPr>
+          <w:rFonts w:ascii="Roboto Mono" w:eastAsia="Roboto Mono" w:hAnsi="Roboto Mono"/>
+        </w:rPr>
+        <w:t xml:space="preserve"> INT,</w:t>
       </w:r>
     </w:p>
     <w:p>
@@ -9670,7 +10543,22 @@
         <w:rPr>
           <w:rFonts w:ascii="Roboto Mono" w:eastAsia="Roboto Mono" w:hAnsi="Roboto Mono"/>
         </w:rPr>
-        <w:t>WHERE TABLE_SCHEMA = 'testdb'</w:t>
+        <w:lastRenderedPageBreak/>
+        <w:t>WHERE TABLE_SCHEMA = '</w:t>
+      </w:r>
+      <w:proofErr w:type="spellStart"/>
+      <w:r>
+        <w:rPr>
+          <w:rFonts w:ascii="Roboto Mono" w:eastAsia="Roboto Mono" w:hAnsi="Roboto Mono"/>
+        </w:rPr>
+        <w:t>testdb</w:t>
+      </w:r>
+      <w:proofErr w:type="spellEnd"/>
+      <w:r>
+        <w:rPr>
+          <w:rFonts w:ascii="Roboto Mono" w:eastAsia="Roboto Mono" w:hAnsi="Roboto Mono"/>
+        </w:rPr>
+        <w:t>'</w:t>
       </w:r>
     </w:p>
     <w:p>
@@ -9747,8 +10635,20 @@
           <w:sz w:val="18"/>
           <w:highlight w:val="lightGray"/>
         </w:rPr>
-        <w:t># Source: ScreenShot</w:t>
-      </w:r>
+        <w:t xml:space="preserve"># Source: </w:t>
+      </w:r>
+      <w:proofErr w:type="spellStart"/>
+      <w:r>
+        <w:rPr>
+          <w:rFonts w:ascii="Arial" w:eastAsia="Arial" w:hAnsi="Arial" w:cs="Arial"/>
+          <w:b/>
+          <w:color w:val="000000"/>
+          <w:sz w:val="18"/>
+          <w:highlight w:val="lightGray"/>
+        </w:rPr>
+        <w:t>ScreenShot</w:t>
+      </w:r>
+      <w:proofErr w:type="spellEnd"/>
       <w:r>
         <w:rPr>
           <w:rFonts w:ascii="Arial" w:eastAsia="Arial" w:hAnsi="Arial" w:cs="Arial"/>
@@ -9794,7 +10694,27 @@
           <w:sz w:val="18"/>
           <w:highlight w:val="lightGray"/>
         </w:rPr>
-        <w:t xml:space="preserve"> [Persons Table -&gt; ID Column: 1, Name_En Column: Motasem Essam] -&gt; </w:t>
+        <w:t xml:space="preserve"> [Persons Table -&gt; ID Column: 1, </w:t>
+      </w:r>
+      <w:proofErr w:type="spellStart"/>
+      <w:r>
+        <w:rPr>
+          <w:rFonts w:ascii="Arial" w:eastAsia="Arial" w:hAnsi="Arial" w:cs="Arial"/>
+          <w:color w:val="000000"/>
+          <w:sz w:val="18"/>
+          <w:highlight w:val="lightGray"/>
+        </w:rPr>
+        <w:t>Name_En</w:t>
+      </w:r>
+      <w:proofErr w:type="spellEnd"/>
+      <w:r>
+        <w:rPr>
+          <w:rFonts w:ascii="Arial" w:eastAsia="Arial" w:hAnsi="Arial" w:cs="Arial"/>
+          <w:color w:val="000000"/>
+          <w:sz w:val="18"/>
+          <w:highlight w:val="lightGray"/>
+        </w:rPr>
+        <w:t xml:space="preserve"> Column: Motasem Essam] -&gt; </w:t>
       </w:r>
       <w:r>
         <w:rPr>
@@ -9813,7 +10733,27 @@
           <w:sz w:val="18"/>
           <w:highlight w:val="lightGray"/>
         </w:rPr>
-        <w:t xml:space="preserve"> [Automation Table -&gt; ID Column: 16, Name_En Column: Screen Capture] -&gt; </w:t>
+        <w:t xml:space="preserve"> [Automation Table -&gt; ID Column: 16, </w:t>
+      </w:r>
+      <w:proofErr w:type="spellStart"/>
+      <w:r>
+        <w:rPr>
+          <w:rFonts w:ascii="Arial" w:eastAsia="Arial" w:hAnsi="Arial" w:cs="Arial"/>
+          <w:color w:val="000000"/>
+          <w:sz w:val="18"/>
+          <w:highlight w:val="lightGray"/>
+        </w:rPr>
+        <w:t>Name_En</w:t>
+      </w:r>
+      <w:proofErr w:type="spellEnd"/>
+      <w:r>
+        <w:rPr>
+          <w:rFonts w:ascii="Arial" w:eastAsia="Arial" w:hAnsi="Arial" w:cs="Arial"/>
+          <w:color w:val="000000"/>
+          <w:sz w:val="18"/>
+          <w:highlight w:val="lightGray"/>
+        </w:rPr>
+        <w:t xml:space="preserve"> Column: Screen Capture] -&gt; </w:t>
       </w:r>
       <w:r>
         <w:rPr>
@@ -9832,7 +10772,27 @@
           <w:sz w:val="18"/>
           <w:highlight w:val="lightGray"/>
         </w:rPr>
-        <w:t xml:space="preserve">[Operating System: Wampserver64 -&gt; phpmyadmin] </w:t>
+        <w:t xml:space="preserve">[Operating System: Wampserver64 -&gt; </w:t>
+      </w:r>
+      <w:proofErr w:type="spellStart"/>
+      <w:r>
+        <w:rPr>
+          <w:rFonts w:ascii="Arial" w:eastAsia="Arial" w:hAnsi="Arial" w:cs="Arial"/>
+          <w:color w:val="000000"/>
+          <w:sz w:val="18"/>
+          <w:highlight w:val="lightGray"/>
+        </w:rPr>
+        <w:t>phpmyadmin</w:t>
+      </w:r>
+      <w:proofErr w:type="spellEnd"/>
+      <w:r>
+        <w:rPr>
+          <w:rFonts w:ascii="Arial" w:eastAsia="Arial" w:hAnsi="Arial" w:cs="Arial"/>
+          <w:color w:val="000000"/>
+          <w:sz w:val="18"/>
+          <w:highlight w:val="lightGray"/>
+        </w:rPr>
+        <w:t xml:space="preserve">] </w:t>
       </w:r>
       <w:r>
         <w:rPr>
@@ -9859,6 +10819,7 @@
         <w:rPr>
           <w:noProof/>
         </w:rPr>
+        <w:lastRenderedPageBreak/>
         <w:drawing>
           <wp:inline distT="114300" distB="114300" distL="114300" distR="114300" wp14:anchorId="282B7B75" wp14:editId="272BED87">
             <wp:extent cx="5943600" cy="3517900"/>
@@ -9901,7 +10862,21 @@
         <w:rPr>
           <w:rFonts w:ascii="Roboto Mono" w:eastAsia="Roboto Mono" w:hAnsi="Roboto Mono"/>
         </w:rPr>
-        <w:t>ALTER TABLE logs ENGINE = MyISAM;</w:t>
+        <w:t xml:space="preserve">ALTER TABLE logs ENGINE = </w:t>
+      </w:r>
+      <w:proofErr w:type="spellStart"/>
+      <w:r>
+        <w:rPr>
+          <w:rFonts w:ascii="Roboto Mono" w:eastAsia="Roboto Mono" w:hAnsi="Roboto Mono"/>
+        </w:rPr>
+        <w:t>MyISAM</w:t>
+      </w:r>
+      <w:proofErr w:type="spellEnd"/>
+      <w:r>
+        <w:rPr>
+          <w:rFonts w:ascii="Roboto Mono" w:eastAsia="Roboto Mono" w:hAnsi="Roboto Mono"/>
+        </w:rPr>
+        <w:t>;</w:t>
       </w:r>
     </w:p>
     <w:p/>
@@ -9952,6 +10927,7 @@
         <w:rPr>
           <w:noProof/>
         </w:rPr>
+        <w:lastRenderedPageBreak/>
         <w:drawing>
           <wp:inline distT="114300" distB="114300" distL="114300" distR="114300" wp14:anchorId="4AA09165" wp14:editId="0CF6BD2A">
             <wp:extent cx="5943600" cy="3505200"/>
@@ -10010,7 +10986,21 @@
         <w:rPr>
           <w:rFonts w:ascii="Roboto Mono" w:eastAsia="Roboto Mono" w:hAnsi="Roboto Mono"/>
         </w:rPr>
-        <w:t>WHERE TABLE_SCHEMA = 'testdb'</w:t>
+        <w:t>WHERE TABLE_SCHEMA = '</w:t>
+      </w:r>
+      <w:proofErr w:type="spellStart"/>
+      <w:r>
+        <w:rPr>
+          <w:rFonts w:ascii="Roboto Mono" w:eastAsia="Roboto Mono" w:hAnsi="Roboto Mono"/>
+        </w:rPr>
+        <w:t>testdb</w:t>
+      </w:r>
+      <w:proofErr w:type="spellEnd"/>
+      <w:r>
+        <w:rPr>
+          <w:rFonts w:ascii="Roboto Mono" w:eastAsia="Roboto Mono" w:hAnsi="Roboto Mono"/>
+        </w:rPr>
+        <w:t>'</w:t>
       </w:r>
     </w:p>
     <w:p>
@@ -10026,6 +11016,7 @@
         <w:rPr>
           <w:noProof/>
         </w:rPr>
+        <w:lastRenderedPageBreak/>
         <w:drawing>
           <wp:inline distT="114300" distB="114300" distL="114300" distR="114300" wp14:anchorId="70C3B631" wp14:editId="1F317003">
             <wp:extent cx="5943600" cy="3352800"/>

</xml_diff>